<commit_message>
Cap. 9: ocupação das visitas sem a mesa do observador
O cap. 9 e a justificativa da R04 citavam a ocupação antiga (26,9% a 60,3%,
média 41,7%). Agora citam 29,9% a 66,9%, média 46,1%. A faixa da R04 é fixa,
então VPL, tornado e ponto de ruptura não mudam.

Co-Authored-By: Claude Opus 5.5 <noreply@anthropic.com>
</commit_message>
<xml_diff>
--- a/textos/capitulos/9_plano_financeiro.docx
+++ b/textos/capitulos/9_plano_financeiro.docx
@@ -4525,7 +4525,7 @@
           <w:sz w:val="24"/>
           <w:szCs w:val="24"/>
         </w:rPr>
-        <w:t xml:space="preserve">As premissas de demanda vêm da contagem direta na São Jogue (B3). Nas quatro visitas — duas em cada unidade, sempre na noite de sexta ou sábado —, os grupos de mesa tiveram de 2,4 a 4,6 pessoas (média de 3,6) e permanência média de 83 a 137 minutos (média de 109). A taxa de ocupação, medida minuto a minuto pelos registros de entrada e saída de cada grupo, ficou entre 26,9% e 60,3% das mesas, com média de 41,7%. As visitas mediram o pico da semana, por orientação: o objetivo foi conhecer a ocupação máxima e o comportamento de clientes e equipe. Por isso, a ocupação de fim de semana do dia inteiro entra abaixo da noite (35% no provável), e a de dia útil é estimativa do autor (N6), fixada em cerca de metade da de fim de semana.</w:t>
+        <w:t xml:space="preserve">As premissas de demanda vêm da contagem direta na São Jogue (B3). Nas quatro visitas — duas em cada unidade, sempre na noite de sexta ou sábado —, os grupos de mesa tiveram de 2,4 a 4,6 pessoas (média de 3,6) e permanência média de 83 a 137 minutos (média de 109). A taxa de ocupação, medida minuto a minuto pelos registros de entrada e saída de cada grupo, sem contar a mesa do observador, ficou entre 29,9% e 66,9% das mesas, com média de 46,1%. As visitas mediram o pico da semana, por orientação: o objetivo foi conhecer a ocupação máxima e o comportamento de clientes e equipe. Por isso, a ocupação de fim de semana do dia inteiro entra abaixo da noite (35% no provável), e a de dia útil é estimativa do autor (N6), fixada em cerca de metade da de fim de semana.</w:t>
       </w:r>
     </w:p>
     <w:p>
@@ -9910,7 +9910,7 @@
           <w:sz w:val="24"/>
           <w:szCs w:val="24"/>
         </w:rPr>
-        <w:t xml:space="preserve">O negócio é viável enquanto a taxa de ocupação de fim de semana ficar acima de 49,5%, com as demais premissas no provável (Tabela 9.5). Esse valor está acima do provável (35%), mas abaixo do pico medido na Paralela em 30/10 (60,3%) e acima da média das quatro noites (41,7%). No dia útil, a ruptura é de 29,7%, acima do otimista da faixa.</w:t>
+        <w:t xml:space="preserve">O negócio é viável enquanto a taxa de ocupação de fim de semana ficar acima de 49,5%, com as demais premissas no provável (Tabela 9.5). Esse valor está acima do provável (35%), mas abaixo do pico medido na Paralela em 30/10 (66,9%) e acima da média das quatro noites (46,1%). No dia útil, a ruptura é de 29,7%, acima do otimista da faixa.</w:t>
       </w:r>
     </w:p>
     <w:p>

</xml_diff>